<commit_message>
Corrections numerator1 and denominator1
Corrected and expanded the text for numerator1 and denominator1, which had been written the wrong way round, so I swapped them to describe them correctly. Also moved the entry for qpi_order so that there was room for the far more important denominator1 and numerator1 to appear on the first page so as to be more prominent.
</commit_message>
<xml_diff>
--- a/docs/Lookup dictionary.docx
+++ b/docs/Lookup dictionary.docx
@@ -1,19 +1,12 @@
 
 <file path=word/document.xml><?xml version="1.0" encoding="utf-8"?>
-<w:document xmlns:wpc="http://schemas.microsoft.com/office/word/2010/wordprocessingCanvas" xmlns:cx="http://schemas.microsoft.com/office/drawing/2014/chartex" xmlns:cx1="http://schemas.microsoft.com/office/drawing/2015/9/8/chartex" xmlns:cx2="http://schemas.microsoft.com/office/drawing/2015/10/21/chartex" xmlns:cx3="http://schemas.microsoft.com/office/drawing/2016/5/9/chartex" xmlns:cx4="http://schemas.microsoft.com/office/drawing/2016/5/10/chartex" xmlns:cx5="http://schemas.microsoft.com/office/drawing/2016/5/11/chartex" xmlns:cx6="http://schemas.microsoft.com/office/drawing/2016/5/12/chartex" xmlns:cx7="http://schemas.microsoft.com/office/drawing/2016/5/13/chartex" xmlns:cx8="http://schemas.microsoft.com/office/drawing/2016/5/14/chartex" xmlns:mc="http://schemas.openxmlformats.org/markup-compatibility/2006" xmlns:aink="http://schemas.microsoft.com/office/drawing/2016/ink" xmlns:am3d="http://schemas.microsoft.com/office/drawing/2017/model3d" xmlns:o="urn:schemas-microsoft-com:office:office" xmlns:oel="http://schemas.microsoft.com/office/2019/extlst" xmlns:r="http://schemas.openxmlformats.org/officeDocument/2006/relationships" xmlns:m="http://schemas.openxmlformats.org/officeDocument/2006/math" xmlns:v="urn:schemas-microsoft-com:vml" xmlns:wp14="http://schemas.microsoft.com/office/word/2010/wordprocessingDrawing" xmlns:wp="http://schemas.openxmlformats.org/drawingml/2006/wordprocessingDrawing" xmlns:w10="urn:schemas-microsoft-com:office:word" xmlns:w="http://schemas.openxmlformats.org/wordprocessingml/2006/main" xmlns:w14="http://schemas.microsoft.com/office/word/2010/wordml" xmlns:w15="http://schemas.microsoft.com/office/word/2012/wordml" xmlns:w16cex="http://schemas.microsoft.com/office/word/2018/wordml/cex" xmlns:w16cid="http://schemas.microsoft.com/office/word/2016/wordml/cid" xmlns:w16="http://schemas.microsoft.com/office/word/2018/wordml" xmlns:w16du="http://schemas.microsoft.com/office/word/2023/wordml/word16du" xmlns:w16sdtdh="http://schemas.microsoft.com/office/word/2020/wordml/sdtdatahash" xmlns:w16se="http://schemas.microsoft.com/office/word/2015/wordml/symex" xmlns:wpg="http://schemas.microsoft.com/office/word/2010/wordprocessingGroup" xmlns:wpi="http://schemas.microsoft.com/office/word/2010/wordprocessingInk" xmlns:wne="http://schemas.microsoft.com/office/word/2006/wordml" xmlns:wps="http://schemas.microsoft.com/office/word/2010/wordprocessingShape" mc:Ignorable="w14 w15 w16se w16cid w16 w16cex w16sdtdh w16du wp14">
+<w:document xmlns:wpc="http://schemas.microsoft.com/office/word/2010/wordprocessingCanvas" xmlns:cx="http://schemas.microsoft.com/office/drawing/2014/chartex" xmlns:cx1="http://schemas.microsoft.com/office/drawing/2015/9/8/chartex" xmlns:cx2="http://schemas.microsoft.com/office/drawing/2015/10/21/chartex" xmlns:cx3="http://schemas.microsoft.com/office/drawing/2016/5/9/chartex" xmlns:cx4="http://schemas.microsoft.com/office/drawing/2016/5/10/chartex" xmlns:cx5="http://schemas.microsoft.com/office/drawing/2016/5/11/chartex" xmlns:cx6="http://schemas.microsoft.com/office/drawing/2016/5/12/chartex" xmlns:cx7="http://schemas.microsoft.com/office/drawing/2016/5/13/chartex" xmlns:cx8="http://schemas.microsoft.com/office/drawing/2016/5/14/chartex" xmlns:mc="http://schemas.openxmlformats.org/markup-compatibility/2006" xmlns:aink="http://schemas.microsoft.com/office/drawing/2016/ink" xmlns:am3d="http://schemas.microsoft.com/office/drawing/2017/model3d" xmlns:o="urn:schemas-microsoft-com:office:office" xmlns:oel="http://schemas.microsoft.com/office/2019/extlst" xmlns:r="http://schemas.openxmlformats.org/officeDocument/2006/relationships" xmlns:m="http://schemas.openxmlformats.org/officeDocument/2006/math" xmlns:v="urn:schemas-microsoft-com:vml" xmlns:wp14="http://schemas.microsoft.com/office/word/2010/wordprocessingDrawing" xmlns:wp="http://schemas.openxmlformats.org/drawingml/2006/wordprocessingDrawing" xmlns:w10="urn:schemas-microsoft-com:office:word" xmlns:w="http://schemas.openxmlformats.org/wordprocessingml/2006/main" xmlns:w14="http://schemas.microsoft.com/office/word/2010/wordml" xmlns:w15="http://schemas.microsoft.com/office/word/2012/wordml" xmlns:w16cex="http://schemas.microsoft.com/office/word/2018/wordml/cex" xmlns:w16cid="http://schemas.microsoft.com/office/word/2016/wordml/cid" xmlns:w16="http://schemas.microsoft.com/office/word/2018/wordml" xmlns:w16du="http://schemas.microsoft.com/office/word/2023/wordml/word16du" xmlns:w16sdtdh="http://schemas.microsoft.com/office/word/2020/wordml/sdtdatahash" xmlns:w16sdtfl="http://schemas.microsoft.com/office/word/2024/wordml/sdtformatlock" xmlns:w16se="http://schemas.microsoft.com/office/word/2015/wordml/symex" xmlns:wpg="http://schemas.microsoft.com/office/word/2010/wordprocessingGroup" xmlns:wpi="http://schemas.microsoft.com/office/word/2010/wordprocessingInk" xmlns:wne="http://schemas.microsoft.com/office/word/2006/wordml" xmlns:wps="http://schemas.microsoft.com/office/word/2010/wordprocessingShape" mc:Ignorable="w14 w15 w16se w16cid w16 w16cex w16sdtdh w16sdtfl w16du wp14">
   <w:body>
     <w:p>
       <w:pPr>
-        <w:rPr>
-          <w:sz w:val="32"/>
-          <w:szCs w:val="32"/>
-        </w:rPr>
-      </w:pPr>
-      <w:r>
-        <w:rPr>
-          <w:sz w:val="32"/>
-          <w:szCs w:val="32"/>
-        </w:rPr>
+        <w:pStyle w:val="Title"/>
+      </w:pPr>
+      <w:r>
         <w:t>Lookup dictionary</w:t>
       </w:r>
     </w:p>
@@ -149,6 +142,13 @@
         </w:rPr>
         <w:t>The TSG in question</w:t>
       </w:r>
+      <w:r>
+        <w:rPr>
+          <w:sz w:val="32"/>
+          <w:szCs w:val="32"/>
+        </w:rPr>
+        <w:t xml:space="preserve"> eg ‘Lung’, ‘Bladder’. </w:t>
+      </w:r>
     </w:p>
     <w:p>
       <w:pPr>
@@ -185,7 +185,248 @@
           <w:sz w:val="32"/>
           <w:szCs w:val="32"/>
         </w:rPr>
-        <w:t>QPI name</w:t>
+        <w:t xml:space="preserve">Short name of the specific </w:t>
+      </w:r>
+      <w:r>
+        <w:rPr>
+          <w:sz w:val="32"/>
+          <w:szCs w:val="32"/>
+        </w:rPr>
+        <w:t xml:space="preserve">QPI </w:t>
+      </w:r>
+      <w:r>
+        <w:rPr>
+          <w:sz w:val="32"/>
+          <w:szCs w:val="32"/>
+        </w:rPr>
+        <w:t xml:space="preserve">(Quality Performance Indicator) for display. </w:t>
+      </w:r>
+    </w:p>
+    <w:p>
+      <w:pPr>
+        <w:rPr>
+          <w:sz w:val="32"/>
+          <w:szCs w:val="32"/>
+        </w:rPr>
+      </w:pPr>
+    </w:p>
+    <w:p>
+      <w:pPr>
+        <w:rPr>
+          <w:sz w:val="32"/>
+          <w:szCs w:val="32"/>
+        </w:rPr>
+      </w:pPr>
+      <w:r>
+        <w:rPr>
+          <w:sz w:val="32"/>
+          <w:szCs w:val="32"/>
+        </w:rPr>
+        <w:t>denominator1</w:t>
+      </w:r>
+    </w:p>
+    <w:p>
+      <w:pPr>
+        <w:rPr>
+          <w:sz w:val="32"/>
+          <w:szCs w:val="32"/>
+        </w:rPr>
+      </w:pPr>
+      <w:r>
+        <w:rPr>
+          <w:sz w:val="32"/>
+          <w:szCs w:val="32"/>
+        </w:rPr>
+        <w:t xml:space="preserve">Description of the denominator of the QPI. The </w:t>
+      </w:r>
+      <w:r>
+        <w:rPr>
+          <w:sz w:val="32"/>
+          <w:szCs w:val="32"/>
+        </w:rPr>
+        <w:t>criteria for inclusion of patients, ie</w:t>
+      </w:r>
+      <w:r>
+        <w:rPr>
+          <w:sz w:val="32"/>
+          <w:szCs w:val="32"/>
+        </w:rPr>
+        <w:t xml:space="preserve"> </w:t>
+      </w:r>
+      <w:r>
+        <w:rPr>
+          <w:sz w:val="32"/>
+          <w:szCs w:val="32"/>
+        </w:rPr>
+        <w:t xml:space="preserve">to be counted as eligible </w:t>
+      </w:r>
+      <w:r>
+        <w:rPr>
+          <w:sz w:val="32"/>
+          <w:szCs w:val="32"/>
+        </w:rPr>
+        <w:t xml:space="preserve">for </w:t>
+      </w:r>
+      <w:r>
+        <w:rPr>
+          <w:sz w:val="32"/>
+          <w:szCs w:val="32"/>
+        </w:rPr>
+        <w:t>that specific</w:t>
+      </w:r>
+      <w:r>
+        <w:rPr>
+          <w:sz w:val="32"/>
+          <w:szCs w:val="32"/>
+        </w:rPr>
+        <w:t xml:space="preserve"> QPI</w:t>
+      </w:r>
+      <w:r>
+        <w:rPr>
+          <w:sz w:val="32"/>
+          <w:szCs w:val="32"/>
+        </w:rPr>
+        <w:t>.</w:t>
+      </w:r>
+      <w:r>
+        <w:rPr>
+          <w:sz w:val="32"/>
+          <w:szCs w:val="32"/>
+        </w:rPr>
+        <w:t xml:space="preserve"> Differentiated from the numerical value of the denominator by the ‘1’ at the end.</w:t>
+      </w:r>
+    </w:p>
+    <w:p>
+      <w:pPr>
+        <w:rPr>
+          <w:sz w:val="32"/>
+          <w:szCs w:val="32"/>
+        </w:rPr>
+      </w:pPr>
+    </w:p>
+    <w:p>
+      <w:pPr>
+        <w:rPr>
+          <w:sz w:val="32"/>
+          <w:szCs w:val="32"/>
+        </w:rPr>
+      </w:pPr>
+      <w:r>
+        <w:rPr>
+          <w:sz w:val="32"/>
+          <w:szCs w:val="32"/>
+        </w:rPr>
+        <w:t>numerator1</w:t>
+      </w:r>
+    </w:p>
+    <w:p>
+      <w:pPr>
+        <w:rPr>
+          <w:sz w:val="32"/>
+          <w:szCs w:val="32"/>
+        </w:rPr>
+      </w:pPr>
+      <w:r>
+        <w:rPr>
+          <w:sz w:val="32"/>
+          <w:szCs w:val="32"/>
+        </w:rPr>
+        <w:t xml:space="preserve">Description of the numerator of the QPI. </w:t>
+      </w:r>
+      <w:r>
+        <w:rPr>
+          <w:sz w:val="32"/>
+          <w:szCs w:val="32"/>
+        </w:rPr>
+        <w:t>Statement of the c</w:t>
+      </w:r>
+      <w:r>
+        <w:rPr>
+          <w:sz w:val="32"/>
+          <w:szCs w:val="32"/>
+        </w:rPr>
+        <w:t>riteria to</w:t>
+      </w:r>
+      <w:r>
+        <w:rPr>
+          <w:sz w:val="32"/>
+          <w:szCs w:val="32"/>
+        </w:rPr>
+        <w:t xml:space="preserve"> identify</w:t>
+      </w:r>
+      <w:r>
+        <w:rPr>
+          <w:sz w:val="32"/>
+          <w:szCs w:val="32"/>
+        </w:rPr>
+        <w:t xml:space="preserve"> all eligible individuals for whom the indicator has been met </w:t>
+      </w:r>
+      <w:r>
+        <w:rPr>
+          <w:sz w:val="32"/>
+          <w:szCs w:val="32"/>
+        </w:rPr>
+        <w:lastRenderedPageBreak/>
+        <w:t>eg who had a certain treatment/outcome etc. Differentiated from the numerical value of the numerator by the ‘1’ at the end.</w:t>
+      </w:r>
+      <w:r>
+        <w:rPr>
+          <w:sz w:val="32"/>
+          <w:szCs w:val="32"/>
+        </w:rPr>
+        <w:t xml:space="preserve"> Thus, the performance level is calculated by dividing the number of patients for whom the target was met, ie the numerator, by the number of eligible patients ie the denominator. </w:t>
+      </w:r>
+    </w:p>
+    <w:p>
+      <w:pPr>
+        <w:rPr>
+          <w:sz w:val="32"/>
+          <w:szCs w:val="32"/>
+        </w:rPr>
+      </w:pPr>
+    </w:p>
+    <w:p>
+      <w:pPr>
+        <w:rPr>
+          <w:sz w:val="32"/>
+          <w:szCs w:val="32"/>
+        </w:rPr>
+      </w:pPr>
+      <w:r>
+        <w:rPr>
+          <w:sz w:val="32"/>
+          <w:szCs w:val="32"/>
+        </w:rPr>
+        <w:t>exclusions1</w:t>
+      </w:r>
+    </w:p>
+    <w:p>
+      <w:pPr>
+        <w:rPr>
+          <w:sz w:val="32"/>
+          <w:szCs w:val="32"/>
+        </w:rPr>
+      </w:pPr>
+      <w:r>
+        <w:rPr>
+          <w:sz w:val="32"/>
+          <w:szCs w:val="32"/>
+        </w:rPr>
+        <w:t xml:space="preserve">Description of the exclusions for a QPI. Some individuals </w:t>
+      </w:r>
+      <w:r>
+        <w:rPr>
+          <w:sz w:val="32"/>
+          <w:szCs w:val="32"/>
+        </w:rPr>
+        <w:t>would otherwise be eligible for a QPI were it not for a specific criteria for exclusion. Differentiated from the numerical value of the exclusion by the ‘1’ at the end.</w:t>
+      </w:r>
+      <w:r>
+        <w:rPr>
+          <w:sz w:val="32"/>
+          <w:szCs w:val="32"/>
+        </w:rPr>
+        <w:t xml:space="preserve"> </w:t>
       </w:r>
     </w:p>
     <w:p>
@@ -241,120 +482,6 @@
           <w:szCs w:val="32"/>
         </w:rPr>
       </w:pPr>
-      <w:r>
-        <w:rPr>
-          <w:sz w:val="32"/>
-          <w:szCs w:val="32"/>
-        </w:rPr>
-        <w:t>numerator1</w:t>
-      </w:r>
-    </w:p>
-    <w:p>
-      <w:pPr>
-        <w:rPr>
-          <w:sz w:val="32"/>
-          <w:szCs w:val="32"/>
-        </w:rPr>
-      </w:pPr>
-      <w:r>
-        <w:rPr>
-          <w:sz w:val="32"/>
-          <w:szCs w:val="32"/>
-        </w:rPr>
-        <w:t>Description of the numerator of the QPI. All individuals who are eligible for a QPI. Differentiated from the numerical value of the numerator by the ‘1’ at the end.</w:t>
-      </w:r>
-    </w:p>
-    <w:p>
-      <w:pPr>
-        <w:rPr>
-          <w:sz w:val="32"/>
-          <w:szCs w:val="32"/>
-        </w:rPr>
-      </w:pPr>
-    </w:p>
-    <w:p>
-      <w:pPr>
-        <w:rPr>
-          <w:sz w:val="32"/>
-          <w:szCs w:val="32"/>
-        </w:rPr>
-      </w:pPr>
-      <w:r>
-        <w:rPr>
-          <w:sz w:val="32"/>
-          <w:szCs w:val="32"/>
-        </w:rPr>
-        <w:t>denominator1</w:t>
-      </w:r>
-    </w:p>
-    <w:p>
-      <w:pPr>
-        <w:rPr>
-          <w:sz w:val="32"/>
-          <w:szCs w:val="32"/>
-        </w:rPr>
-      </w:pPr>
-      <w:r>
-        <w:rPr>
-          <w:sz w:val="32"/>
-          <w:szCs w:val="32"/>
-        </w:rPr>
-        <w:lastRenderedPageBreak/>
-        <w:t>Description of the denominator of the QPI. The number of individuals who are eligible for a QPI who have met it; had a certain treatment/outcome etc. Differentiated from the numerical value of the denominator by the ‘1’ at the end.</w:t>
-      </w:r>
-    </w:p>
-    <w:p>
-      <w:pPr>
-        <w:rPr>
-          <w:sz w:val="32"/>
-          <w:szCs w:val="32"/>
-        </w:rPr>
-      </w:pPr>
-    </w:p>
-    <w:p>
-      <w:pPr>
-        <w:rPr>
-          <w:sz w:val="32"/>
-          <w:szCs w:val="32"/>
-        </w:rPr>
-      </w:pPr>
-      <w:r>
-        <w:rPr>
-          <w:sz w:val="32"/>
-          <w:szCs w:val="32"/>
-        </w:rPr>
-        <w:t>exclusions1</w:t>
-      </w:r>
-    </w:p>
-    <w:p>
-      <w:pPr>
-        <w:rPr>
-          <w:sz w:val="32"/>
-          <w:szCs w:val="32"/>
-        </w:rPr>
-      </w:pPr>
-      <w:r>
-        <w:rPr>
-          <w:sz w:val="32"/>
-          <w:szCs w:val="32"/>
-        </w:rPr>
-        <w:t xml:space="preserve">Description of the exclusions for a QPI. Some individuals </w:t>
-      </w:r>
-      <w:r>
-        <w:rPr>
-          <w:sz w:val="32"/>
-          <w:szCs w:val="32"/>
-        </w:rPr>
-        <w:t>would otherwise be eligible for a QPI were it not for a specific criteria for exclusion. Differentiated from the numerical value of the exclusion by the ‘1’ at the end.</w:t>
-      </w:r>
-    </w:p>
-    <w:p>
-      <w:pPr>
-        <w:rPr>
-          <w:sz w:val="32"/>
-          <w:szCs w:val="32"/>
-        </w:rPr>
-      </w:pPr>
     </w:p>
     <w:p>
       <w:pPr>
@@ -535,7 +662,6 @@
           <w:sz w:val="32"/>
           <w:szCs w:val="32"/>
         </w:rPr>
-        <w:lastRenderedPageBreak/>
         <w:t>Not used</w:t>
       </w:r>
       <w:r>
@@ -1150,6 +1276,7 @@
                 <w:sz w:val="32"/>
                 <w:szCs w:val="32"/>
               </w:rPr>
+              <w:lastRenderedPageBreak/>
               <w:t>L</w:t>
             </w:r>
           </w:p>
@@ -1423,7 +1550,6 @@
           <w:sz w:val="32"/>
           <w:szCs w:val="32"/>
         </w:rPr>
-        <w:lastRenderedPageBreak/>
         <w:t>SurgDiag</w:t>
       </w:r>
     </w:p>
@@ -1467,7 +1593,7 @@
 </file>
 
 <file path=word/comments.xml><?xml version="1.0" encoding="utf-8"?>
-<w:comments xmlns:wpc="http://schemas.microsoft.com/office/word/2010/wordprocessingCanvas" xmlns:cx="http://schemas.microsoft.com/office/drawing/2014/chartex" xmlns:cx1="http://schemas.microsoft.com/office/drawing/2015/9/8/chartex" xmlns:cx2="http://schemas.microsoft.com/office/drawing/2015/10/21/chartex" xmlns:cx3="http://schemas.microsoft.com/office/drawing/2016/5/9/chartex" xmlns:cx4="http://schemas.microsoft.com/office/drawing/2016/5/10/chartex" xmlns:cx5="http://schemas.microsoft.com/office/drawing/2016/5/11/chartex" xmlns:cx6="http://schemas.microsoft.com/office/drawing/2016/5/12/chartex" xmlns:cx7="http://schemas.microsoft.com/office/drawing/2016/5/13/chartex" xmlns:cx8="http://schemas.microsoft.com/office/drawing/2016/5/14/chartex" xmlns:mc="http://schemas.openxmlformats.org/markup-compatibility/2006" xmlns:aink="http://schemas.microsoft.com/office/drawing/2016/ink" xmlns:am3d="http://schemas.microsoft.com/office/drawing/2017/model3d" xmlns:o="urn:schemas-microsoft-com:office:office" xmlns:oel="http://schemas.microsoft.com/office/2019/extlst" xmlns:r="http://schemas.openxmlformats.org/officeDocument/2006/relationships" xmlns:m="http://schemas.openxmlformats.org/officeDocument/2006/math" xmlns:v="urn:schemas-microsoft-com:vml" xmlns:wp14="http://schemas.microsoft.com/office/word/2010/wordprocessingDrawing" xmlns:wp="http://schemas.openxmlformats.org/drawingml/2006/wordprocessingDrawing" xmlns:w10="urn:schemas-microsoft-com:office:word" xmlns:w="http://schemas.openxmlformats.org/wordprocessingml/2006/main" xmlns:w14="http://schemas.microsoft.com/office/word/2010/wordml" xmlns:w15="http://schemas.microsoft.com/office/word/2012/wordml" xmlns:w16cex="http://schemas.microsoft.com/office/word/2018/wordml/cex" xmlns:w16cid="http://schemas.microsoft.com/office/word/2016/wordml/cid" xmlns:w16="http://schemas.microsoft.com/office/word/2018/wordml" xmlns:w16du="http://schemas.microsoft.com/office/word/2023/wordml/word16du" xmlns:w16sdtdh="http://schemas.microsoft.com/office/word/2020/wordml/sdtdatahash" xmlns:w16se="http://schemas.microsoft.com/office/word/2015/wordml/symex" xmlns:wpg="http://schemas.microsoft.com/office/word/2010/wordprocessingGroup" xmlns:wpi="http://schemas.microsoft.com/office/word/2010/wordprocessingInk" xmlns:wne="http://schemas.microsoft.com/office/word/2006/wordml" xmlns:wps="http://schemas.microsoft.com/office/word/2010/wordprocessingShape" mc:Ignorable="w14 w15 w16se w16cid w16 w16cex w16sdtdh w16du wp14">
+<w:comments xmlns:wpc="http://schemas.microsoft.com/office/word/2010/wordprocessingCanvas" xmlns:cx="http://schemas.microsoft.com/office/drawing/2014/chartex" xmlns:cx1="http://schemas.microsoft.com/office/drawing/2015/9/8/chartex" xmlns:cx2="http://schemas.microsoft.com/office/drawing/2015/10/21/chartex" xmlns:cx3="http://schemas.microsoft.com/office/drawing/2016/5/9/chartex" xmlns:cx4="http://schemas.microsoft.com/office/drawing/2016/5/10/chartex" xmlns:cx5="http://schemas.microsoft.com/office/drawing/2016/5/11/chartex" xmlns:cx6="http://schemas.microsoft.com/office/drawing/2016/5/12/chartex" xmlns:cx7="http://schemas.microsoft.com/office/drawing/2016/5/13/chartex" xmlns:cx8="http://schemas.microsoft.com/office/drawing/2016/5/14/chartex" xmlns:mc="http://schemas.openxmlformats.org/markup-compatibility/2006" xmlns:aink="http://schemas.microsoft.com/office/drawing/2016/ink" xmlns:am3d="http://schemas.microsoft.com/office/drawing/2017/model3d" xmlns:o="urn:schemas-microsoft-com:office:office" xmlns:oel="http://schemas.microsoft.com/office/2019/extlst" xmlns:r="http://schemas.openxmlformats.org/officeDocument/2006/relationships" xmlns:m="http://schemas.openxmlformats.org/officeDocument/2006/math" xmlns:v="urn:schemas-microsoft-com:vml" xmlns:wp14="http://schemas.microsoft.com/office/word/2010/wordprocessingDrawing" xmlns:wp="http://schemas.openxmlformats.org/drawingml/2006/wordprocessingDrawing" xmlns:w10="urn:schemas-microsoft-com:office:word" xmlns:w="http://schemas.openxmlformats.org/wordprocessingml/2006/main" xmlns:w14="http://schemas.microsoft.com/office/word/2010/wordml" xmlns:w15="http://schemas.microsoft.com/office/word/2012/wordml" xmlns:w16cex="http://schemas.microsoft.com/office/word/2018/wordml/cex" xmlns:w16cid="http://schemas.microsoft.com/office/word/2016/wordml/cid" xmlns:w16="http://schemas.microsoft.com/office/word/2018/wordml" xmlns:w16du="http://schemas.microsoft.com/office/word/2023/wordml/word16du" xmlns:w16sdtdh="http://schemas.microsoft.com/office/word/2020/wordml/sdtdatahash" xmlns:w16sdtfl="http://schemas.microsoft.com/office/word/2024/wordml/sdtformatlock" xmlns:w16se="http://schemas.microsoft.com/office/word/2015/wordml/symex" xmlns:wpg="http://schemas.microsoft.com/office/word/2010/wordprocessingGroup" xmlns:wpi="http://schemas.microsoft.com/office/word/2010/wordprocessingInk" xmlns:wne="http://schemas.microsoft.com/office/word/2006/wordml" xmlns:wps="http://schemas.microsoft.com/office/word/2010/wordprocessingShape" mc:Ignorable="w14 w15 w16se w16cid w16 w16cex w16sdtdh w16sdtfl w16du wp14">
   <w:comment w:id="0" w:author="Pauline Ward" w:date="2024-11-19T09:13:00Z" w:initials="PW">
     <w:p>
       <w:pPr>
@@ -1504,28 +1630,28 @@
 </file>
 
 <file path=word/commentsExtended.xml><?xml version="1.0" encoding="utf-8"?>
-<w15:commentsEx xmlns:wpc="http://schemas.microsoft.com/office/word/2010/wordprocessingCanvas" xmlns:cx="http://schemas.microsoft.com/office/drawing/2014/chartex" xmlns:cx1="http://schemas.microsoft.com/office/drawing/2015/9/8/chartex" xmlns:cx2="http://schemas.microsoft.com/office/drawing/2015/10/21/chartex" xmlns:cx3="http://schemas.microsoft.com/office/drawing/2016/5/9/chartex" xmlns:cx4="http://schemas.microsoft.com/office/drawing/2016/5/10/chartex" xmlns:cx5="http://schemas.microsoft.com/office/drawing/2016/5/11/chartex" xmlns:cx6="http://schemas.microsoft.com/office/drawing/2016/5/12/chartex" xmlns:cx7="http://schemas.microsoft.com/office/drawing/2016/5/13/chartex" xmlns:cx8="http://schemas.microsoft.com/office/drawing/2016/5/14/chartex" xmlns:mc="http://schemas.openxmlformats.org/markup-compatibility/2006" xmlns:aink="http://schemas.microsoft.com/office/drawing/2016/ink" xmlns:am3d="http://schemas.microsoft.com/office/drawing/2017/model3d" xmlns:o="urn:schemas-microsoft-com:office:office" xmlns:oel="http://schemas.microsoft.com/office/2019/extlst" xmlns:r="http://schemas.openxmlformats.org/officeDocument/2006/relationships" xmlns:m="http://schemas.openxmlformats.org/officeDocument/2006/math" xmlns:v="urn:schemas-microsoft-com:vml" xmlns:wp14="http://schemas.microsoft.com/office/word/2010/wordprocessingDrawing" xmlns:wp="http://schemas.openxmlformats.org/drawingml/2006/wordprocessingDrawing" xmlns:w10="urn:schemas-microsoft-com:office:word" xmlns:w="http://schemas.openxmlformats.org/wordprocessingml/2006/main" xmlns:w14="http://schemas.microsoft.com/office/word/2010/wordml" xmlns:w15="http://schemas.microsoft.com/office/word/2012/wordml" xmlns:w16cex="http://schemas.microsoft.com/office/word/2018/wordml/cex" xmlns:w16cid="http://schemas.microsoft.com/office/word/2016/wordml/cid" xmlns:w16="http://schemas.microsoft.com/office/word/2018/wordml" xmlns:w16du="http://schemas.microsoft.com/office/word/2023/wordml/word16du" xmlns:w16sdtdh="http://schemas.microsoft.com/office/word/2020/wordml/sdtdatahash" xmlns:w16se="http://schemas.microsoft.com/office/word/2015/wordml/symex" xmlns:wpg="http://schemas.microsoft.com/office/word/2010/wordprocessingGroup" xmlns:wpi="http://schemas.microsoft.com/office/word/2010/wordprocessingInk" xmlns:wne="http://schemas.microsoft.com/office/word/2006/wordml" xmlns:wps="http://schemas.microsoft.com/office/word/2010/wordprocessingShape" mc:Ignorable="w14 w15 w16se w16cid w16 w16cex w16sdtdh w16du wp14">
+<w15:commentsEx xmlns:wpc="http://schemas.microsoft.com/office/word/2010/wordprocessingCanvas" xmlns:cx="http://schemas.microsoft.com/office/drawing/2014/chartex" xmlns:cx1="http://schemas.microsoft.com/office/drawing/2015/9/8/chartex" xmlns:cx2="http://schemas.microsoft.com/office/drawing/2015/10/21/chartex" xmlns:cx3="http://schemas.microsoft.com/office/drawing/2016/5/9/chartex" xmlns:cx4="http://schemas.microsoft.com/office/drawing/2016/5/10/chartex" xmlns:cx5="http://schemas.microsoft.com/office/drawing/2016/5/11/chartex" xmlns:cx6="http://schemas.microsoft.com/office/drawing/2016/5/12/chartex" xmlns:cx7="http://schemas.microsoft.com/office/drawing/2016/5/13/chartex" xmlns:cx8="http://schemas.microsoft.com/office/drawing/2016/5/14/chartex" xmlns:mc="http://schemas.openxmlformats.org/markup-compatibility/2006" xmlns:aink="http://schemas.microsoft.com/office/drawing/2016/ink" xmlns:am3d="http://schemas.microsoft.com/office/drawing/2017/model3d" xmlns:o="urn:schemas-microsoft-com:office:office" xmlns:oel="http://schemas.microsoft.com/office/2019/extlst" xmlns:r="http://schemas.openxmlformats.org/officeDocument/2006/relationships" xmlns:m="http://schemas.openxmlformats.org/officeDocument/2006/math" xmlns:v="urn:schemas-microsoft-com:vml" xmlns:wp14="http://schemas.microsoft.com/office/word/2010/wordprocessingDrawing" xmlns:wp="http://schemas.openxmlformats.org/drawingml/2006/wordprocessingDrawing" xmlns:w10="urn:schemas-microsoft-com:office:word" xmlns:w="http://schemas.openxmlformats.org/wordprocessingml/2006/main" xmlns:w14="http://schemas.microsoft.com/office/word/2010/wordml" xmlns:w15="http://schemas.microsoft.com/office/word/2012/wordml" xmlns:w16cex="http://schemas.microsoft.com/office/word/2018/wordml/cex" xmlns:w16cid="http://schemas.microsoft.com/office/word/2016/wordml/cid" xmlns:w16="http://schemas.microsoft.com/office/word/2018/wordml" xmlns:w16du="http://schemas.microsoft.com/office/word/2023/wordml/word16du" xmlns:w16sdtdh="http://schemas.microsoft.com/office/word/2020/wordml/sdtdatahash" xmlns:w16sdtfl="http://schemas.microsoft.com/office/word/2024/wordml/sdtformatlock" xmlns:w16se="http://schemas.microsoft.com/office/word/2015/wordml/symex" xmlns:wpg="http://schemas.microsoft.com/office/word/2010/wordprocessingGroup" xmlns:wpi="http://schemas.microsoft.com/office/word/2010/wordprocessingInk" xmlns:wne="http://schemas.microsoft.com/office/word/2006/wordml" xmlns:wps="http://schemas.microsoft.com/office/word/2010/wordprocessingShape" mc:Ignorable="w14 w15 w16se w16cid w16 w16cex w16sdtdh w16sdtfl w16du wp14">
   <w15:commentEx w15:paraId="4D0BC841" w15:done="0"/>
   <w15:commentEx w15:paraId="3B0DDA2A" w15:done="0"/>
 </w15:commentsEx>
 </file>
 
 <file path=word/commentsExtensible.xml><?xml version="1.0" encoding="utf-8"?>
-<w16cex:commentsExtensible xmlns:wpc="http://schemas.microsoft.com/office/word/2010/wordprocessingCanvas" xmlns:cx="http://schemas.microsoft.com/office/drawing/2014/chartex" xmlns:cx1="http://schemas.microsoft.com/office/drawing/2015/9/8/chartex" xmlns:cx2="http://schemas.microsoft.com/office/drawing/2015/10/21/chartex" xmlns:cx3="http://schemas.microsoft.com/office/drawing/2016/5/9/chartex" xmlns:cx4="http://schemas.microsoft.com/office/drawing/2016/5/10/chartex" xmlns:cx5="http://schemas.microsoft.com/office/drawing/2016/5/11/chartex" xmlns:cx6="http://schemas.microsoft.com/office/drawing/2016/5/12/chartex" xmlns:cx7="http://schemas.microsoft.com/office/drawing/2016/5/13/chartex" xmlns:cx8="http://schemas.microsoft.com/office/drawing/2016/5/14/chartex" xmlns:cr="http://schemas.microsoft.com/office/comments/2020/reactions" xmlns:mc="http://schemas.openxmlformats.org/markup-compatibility/2006" xmlns:aink="http://schemas.microsoft.com/office/drawing/2016/ink" xmlns:am3d="http://schemas.microsoft.com/office/drawing/2017/model3d" xmlns:o="urn:schemas-microsoft-com:office:office" xmlns:oel="http://schemas.microsoft.com/office/2019/extlst" xmlns:r="http://schemas.openxmlformats.org/officeDocument/2006/relationships" xmlns:m="http://schemas.openxmlformats.org/officeDocument/2006/math" xmlns:v="urn:schemas-microsoft-com:vml" xmlns:wp14="http://schemas.microsoft.com/office/word/2010/wordprocessingDrawing" xmlns:wp="http://schemas.openxmlformats.org/drawingml/2006/wordprocessingDrawing" xmlns:w10="urn:schemas-microsoft-com:office:word" xmlns:w="http://schemas.openxmlformats.org/wordprocessingml/2006/main" xmlns:w14="http://schemas.microsoft.com/office/word/2010/wordml" xmlns:w15="http://schemas.microsoft.com/office/word/2012/wordml" xmlns:w16cex="http://schemas.microsoft.com/office/word/2018/wordml/cex" xmlns:w16cid="http://schemas.microsoft.com/office/word/2016/wordml/cid" xmlns:w16="http://schemas.microsoft.com/office/word/2018/wordml" xmlns:w16du="http://schemas.microsoft.com/office/word/2023/wordml/word16du" xmlns:w16sdtdh="http://schemas.microsoft.com/office/word/2020/wordml/sdtdatahash" xmlns:w16se="http://schemas.microsoft.com/office/word/2015/wordml/symex" xmlns:wpg="http://schemas.microsoft.com/office/word/2010/wordprocessingGroup" xmlns:wpi="http://schemas.microsoft.com/office/word/2010/wordprocessingInk" xmlns:wne="http://schemas.microsoft.com/office/word/2006/wordml" xmlns:wps="http://schemas.microsoft.com/office/word/2010/wordprocessingShape" mc:Ignorable="w14 w15 w16se w16cid w16 w16cex w16sdtdh cr w16du wp14">
+<w16cex:commentsExtensible xmlns:wpc="http://schemas.microsoft.com/office/word/2010/wordprocessingCanvas" xmlns:cx="http://schemas.microsoft.com/office/drawing/2014/chartex" xmlns:cx1="http://schemas.microsoft.com/office/drawing/2015/9/8/chartex" xmlns:cx2="http://schemas.microsoft.com/office/drawing/2015/10/21/chartex" xmlns:cx3="http://schemas.microsoft.com/office/drawing/2016/5/9/chartex" xmlns:cx4="http://schemas.microsoft.com/office/drawing/2016/5/10/chartex" xmlns:cx5="http://schemas.microsoft.com/office/drawing/2016/5/11/chartex" xmlns:cx6="http://schemas.microsoft.com/office/drawing/2016/5/12/chartex" xmlns:cx7="http://schemas.microsoft.com/office/drawing/2016/5/13/chartex" xmlns:cx8="http://schemas.microsoft.com/office/drawing/2016/5/14/chartex" xmlns:cr="http://schemas.microsoft.com/office/comments/2020/reactions" xmlns:mc="http://schemas.openxmlformats.org/markup-compatibility/2006" xmlns:aink="http://schemas.microsoft.com/office/drawing/2016/ink" xmlns:am3d="http://schemas.microsoft.com/office/drawing/2017/model3d" xmlns:o="urn:schemas-microsoft-com:office:office" xmlns:oel="http://schemas.microsoft.com/office/2019/extlst" xmlns:r="http://schemas.openxmlformats.org/officeDocument/2006/relationships" xmlns:m="http://schemas.openxmlformats.org/officeDocument/2006/math" xmlns:v="urn:schemas-microsoft-com:vml" xmlns:wp14="http://schemas.microsoft.com/office/word/2010/wordprocessingDrawing" xmlns:wp="http://schemas.openxmlformats.org/drawingml/2006/wordprocessingDrawing" xmlns:w10="urn:schemas-microsoft-com:office:word" xmlns:w="http://schemas.openxmlformats.org/wordprocessingml/2006/main" xmlns:w14="http://schemas.microsoft.com/office/word/2010/wordml" xmlns:w15="http://schemas.microsoft.com/office/word/2012/wordml" xmlns:w16cex="http://schemas.microsoft.com/office/word/2018/wordml/cex" xmlns:w16cid="http://schemas.microsoft.com/office/word/2016/wordml/cid" xmlns:w16="http://schemas.microsoft.com/office/word/2018/wordml" xmlns:w16du="http://schemas.microsoft.com/office/word/2023/wordml/word16du" xmlns:w16sdtdh="http://schemas.microsoft.com/office/word/2020/wordml/sdtdatahash" xmlns:w16sdtfl="http://schemas.microsoft.com/office/word/2024/wordml/sdtformatlock" xmlns:w16se="http://schemas.microsoft.com/office/word/2015/wordml/symex" xmlns:wpg="http://schemas.microsoft.com/office/word/2010/wordprocessingGroup" xmlns:wpi="http://schemas.microsoft.com/office/word/2010/wordprocessingInk" xmlns:wne="http://schemas.microsoft.com/office/word/2006/wordml" xmlns:wps="http://schemas.microsoft.com/office/word/2010/wordprocessingShape" mc:Ignorable="w14 w15 w16se w16cid w16 w16cex w16sdtdh w16sdtfl cr w16du wp14">
   <w16cex:commentExtensible w16cex:durableId="4FE6F7D1" w16cex:dateUtc="2024-11-19T09:13:00Z"/>
   <w16cex:commentExtensible w16cex:durableId="0690ABD4" w16cex:dateUtc="2024-11-19T09:14:00Z"/>
 </w16cex:commentsExtensible>
 </file>
 
 <file path=word/commentsIds.xml><?xml version="1.0" encoding="utf-8"?>
-<w16cid:commentsIds xmlns:wpc="http://schemas.microsoft.com/office/word/2010/wordprocessingCanvas" xmlns:cx="http://schemas.microsoft.com/office/drawing/2014/chartex" xmlns:cx1="http://schemas.microsoft.com/office/drawing/2015/9/8/chartex" xmlns:cx2="http://schemas.microsoft.com/office/drawing/2015/10/21/chartex" xmlns:cx3="http://schemas.microsoft.com/office/drawing/2016/5/9/chartex" xmlns:cx4="http://schemas.microsoft.com/office/drawing/2016/5/10/chartex" xmlns:cx5="http://schemas.microsoft.com/office/drawing/2016/5/11/chartex" xmlns:cx6="http://schemas.microsoft.com/office/drawing/2016/5/12/chartex" xmlns:cx7="http://schemas.microsoft.com/office/drawing/2016/5/13/chartex" xmlns:cx8="http://schemas.microsoft.com/office/drawing/2016/5/14/chartex" xmlns:mc="http://schemas.openxmlformats.org/markup-compatibility/2006" xmlns:aink="http://schemas.microsoft.com/office/drawing/2016/ink" xmlns:am3d="http://schemas.microsoft.com/office/drawing/2017/model3d" xmlns:o="urn:schemas-microsoft-com:office:office" xmlns:oel="http://schemas.microsoft.com/office/2019/extlst" xmlns:r="http://schemas.openxmlformats.org/officeDocument/2006/relationships" xmlns:m="http://schemas.openxmlformats.org/officeDocument/2006/math" xmlns:v="urn:schemas-microsoft-com:vml" xmlns:wp14="http://schemas.microsoft.com/office/word/2010/wordprocessingDrawing" xmlns:wp="http://schemas.openxmlformats.org/drawingml/2006/wordprocessingDrawing" xmlns:w10="urn:schemas-microsoft-com:office:word" xmlns:w="http://schemas.openxmlformats.org/wordprocessingml/2006/main" xmlns:w14="http://schemas.microsoft.com/office/word/2010/wordml" xmlns:w15="http://schemas.microsoft.com/office/word/2012/wordml" xmlns:w16cex="http://schemas.microsoft.com/office/word/2018/wordml/cex" xmlns:w16cid="http://schemas.microsoft.com/office/word/2016/wordml/cid" xmlns:w16="http://schemas.microsoft.com/office/word/2018/wordml" xmlns:w16du="http://schemas.microsoft.com/office/word/2023/wordml/word16du" xmlns:w16sdtdh="http://schemas.microsoft.com/office/word/2020/wordml/sdtdatahash" xmlns:w16se="http://schemas.microsoft.com/office/word/2015/wordml/symex" xmlns:wpg="http://schemas.microsoft.com/office/word/2010/wordprocessingGroup" xmlns:wpi="http://schemas.microsoft.com/office/word/2010/wordprocessingInk" xmlns:wne="http://schemas.microsoft.com/office/word/2006/wordml" xmlns:wps="http://schemas.microsoft.com/office/word/2010/wordprocessingShape" mc:Ignorable="w14 w15 w16se w16cid w16 w16cex w16sdtdh w16du wp14">
+<w16cid:commentsIds xmlns:wpc="http://schemas.microsoft.com/office/word/2010/wordprocessingCanvas" xmlns:cx="http://schemas.microsoft.com/office/drawing/2014/chartex" xmlns:cx1="http://schemas.microsoft.com/office/drawing/2015/9/8/chartex" xmlns:cx2="http://schemas.microsoft.com/office/drawing/2015/10/21/chartex" xmlns:cx3="http://schemas.microsoft.com/office/drawing/2016/5/9/chartex" xmlns:cx4="http://schemas.microsoft.com/office/drawing/2016/5/10/chartex" xmlns:cx5="http://schemas.microsoft.com/office/drawing/2016/5/11/chartex" xmlns:cx6="http://schemas.microsoft.com/office/drawing/2016/5/12/chartex" xmlns:cx7="http://schemas.microsoft.com/office/drawing/2016/5/13/chartex" xmlns:cx8="http://schemas.microsoft.com/office/drawing/2016/5/14/chartex" xmlns:mc="http://schemas.openxmlformats.org/markup-compatibility/2006" xmlns:aink="http://schemas.microsoft.com/office/drawing/2016/ink" xmlns:am3d="http://schemas.microsoft.com/office/drawing/2017/model3d" xmlns:o="urn:schemas-microsoft-com:office:office" xmlns:oel="http://schemas.microsoft.com/office/2019/extlst" xmlns:r="http://schemas.openxmlformats.org/officeDocument/2006/relationships" xmlns:m="http://schemas.openxmlformats.org/officeDocument/2006/math" xmlns:v="urn:schemas-microsoft-com:vml" xmlns:wp14="http://schemas.microsoft.com/office/word/2010/wordprocessingDrawing" xmlns:wp="http://schemas.openxmlformats.org/drawingml/2006/wordprocessingDrawing" xmlns:w10="urn:schemas-microsoft-com:office:word" xmlns:w="http://schemas.openxmlformats.org/wordprocessingml/2006/main" xmlns:w14="http://schemas.microsoft.com/office/word/2010/wordml" xmlns:w15="http://schemas.microsoft.com/office/word/2012/wordml" xmlns:w16cex="http://schemas.microsoft.com/office/word/2018/wordml/cex" xmlns:w16cid="http://schemas.microsoft.com/office/word/2016/wordml/cid" xmlns:w16="http://schemas.microsoft.com/office/word/2018/wordml" xmlns:w16du="http://schemas.microsoft.com/office/word/2023/wordml/word16du" xmlns:w16sdtdh="http://schemas.microsoft.com/office/word/2020/wordml/sdtdatahash" xmlns:w16sdtfl="http://schemas.microsoft.com/office/word/2024/wordml/sdtformatlock" xmlns:w16se="http://schemas.microsoft.com/office/word/2015/wordml/symex" xmlns:wpg="http://schemas.microsoft.com/office/word/2010/wordprocessingGroup" xmlns:wpi="http://schemas.microsoft.com/office/word/2010/wordprocessingInk" xmlns:wne="http://schemas.microsoft.com/office/word/2006/wordml" xmlns:wps="http://schemas.microsoft.com/office/word/2010/wordprocessingShape" mc:Ignorable="w14 w15 w16se w16cid w16 w16cex w16sdtdh w16sdtfl w16du wp14">
   <w16cid:commentId w16cid:paraId="4D0BC841" w16cid:durableId="4FE6F7D1"/>
   <w16cid:commentId w16cid:paraId="3B0DDA2A" w16cid:durableId="0690ABD4"/>
 </w16cid:commentsIds>
 </file>
 
 <file path=word/people.xml><?xml version="1.0" encoding="utf-8"?>
-<w15:people xmlns:wpc="http://schemas.microsoft.com/office/word/2010/wordprocessingCanvas" xmlns:cx="http://schemas.microsoft.com/office/drawing/2014/chartex" xmlns:cx1="http://schemas.microsoft.com/office/drawing/2015/9/8/chartex" xmlns:cx2="http://schemas.microsoft.com/office/drawing/2015/10/21/chartex" xmlns:cx3="http://schemas.microsoft.com/office/drawing/2016/5/9/chartex" xmlns:cx4="http://schemas.microsoft.com/office/drawing/2016/5/10/chartex" xmlns:cx5="http://schemas.microsoft.com/office/drawing/2016/5/11/chartex" xmlns:cx6="http://schemas.microsoft.com/office/drawing/2016/5/12/chartex" xmlns:cx7="http://schemas.microsoft.com/office/drawing/2016/5/13/chartex" xmlns:cx8="http://schemas.microsoft.com/office/drawing/2016/5/14/chartex" xmlns:mc="http://schemas.openxmlformats.org/markup-compatibility/2006" xmlns:aink="http://schemas.microsoft.com/office/drawing/2016/ink" xmlns:am3d="http://schemas.microsoft.com/office/drawing/2017/model3d" xmlns:o="urn:schemas-microsoft-com:office:office" xmlns:oel="http://schemas.microsoft.com/office/2019/extlst" xmlns:r="http://schemas.openxmlformats.org/officeDocument/2006/relationships" xmlns:m="http://schemas.openxmlformats.org/officeDocument/2006/math" xmlns:v="urn:schemas-microsoft-com:vml" xmlns:wp14="http://schemas.microsoft.com/office/word/2010/wordprocessingDrawing" xmlns:wp="http://schemas.openxmlformats.org/drawingml/2006/wordprocessingDrawing" xmlns:w10="urn:schemas-microsoft-com:office:word" xmlns:w="http://schemas.openxmlformats.org/wordprocessingml/2006/main" xmlns:w14="http://schemas.microsoft.com/office/word/2010/wordml" xmlns:w15="http://schemas.microsoft.com/office/word/2012/wordml" xmlns:w16cex="http://schemas.microsoft.com/office/word/2018/wordml/cex" xmlns:w16cid="http://schemas.microsoft.com/office/word/2016/wordml/cid" xmlns:w16="http://schemas.microsoft.com/office/word/2018/wordml" xmlns:w16du="http://schemas.microsoft.com/office/word/2023/wordml/word16du" xmlns:w16sdtdh="http://schemas.microsoft.com/office/word/2020/wordml/sdtdatahash" xmlns:w16se="http://schemas.microsoft.com/office/word/2015/wordml/symex" xmlns:wpg="http://schemas.microsoft.com/office/word/2010/wordprocessingGroup" xmlns:wpi="http://schemas.microsoft.com/office/word/2010/wordprocessingInk" xmlns:wne="http://schemas.microsoft.com/office/word/2006/wordml" xmlns:wps="http://schemas.microsoft.com/office/word/2010/wordprocessingShape" mc:Ignorable="w14 w15 w16se w16cid w16 w16cex w16sdtdh w16du wp14">
+<w15:people xmlns:wpc="http://schemas.microsoft.com/office/word/2010/wordprocessingCanvas" xmlns:cx="http://schemas.microsoft.com/office/drawing/2014/chartex" xmlns:cx1="http://schemas.microsoft.com/office/drawing/2015/9/8/chartex" xmlns:cx2="http://schemas.microsoft.com/office/drawing/2015/10/21/chartex" xmlns:cx3="http://schemas.microsoft.com/office/drawing/2016/5/9/chartex" xmlns:cx4="http://schemas.microsoft.com/office/drawing/2016/5/10/chartex" xmlns:cx5="http://schemas.microsoft.com/office/drawing/2016/5/11/chartex" xmlns:cx6="http://schemas.microsoft.com/office/drawing/2016/5/12/chartex" xmlns:cx7="http://schemas.microsoft.com/office/drawing/2016/5/13/chartex" xmlns:cx8="http://schemas.microsoft.com/office/drawing/2016/5/14/chartex" xmlns:mc="http://schemas.openxmlformats.org/markup-compatibility/2006" xmlns:aink="http://schemas.microsoft.com/office/drawing/2016/ink" xmlns:am3d="http://schemas.microsoft.com/office/drawing/2017/model3d" xmlns:o="urn:schemas-microsoft-com:office:office" xmlns:oel="http://schemas.microsoft.com/office/2019/extlst" xmlns:r="http://schemas.openxmlformats.org/officeDocument/2006/relationships" xmlns:m="http://schemas.openxmlformats.org/officeDocument/2006/math" xmlns:v="urn:schemas-microsoft-com:vml" xmlns:wp14="http://schemas.microsoft.com/office/word/2010/wordprocessingDrawing" xmlns:wp="http://schemas.openxmlformats.org/drawingml/2006/wordprocessingDrawing" xmlns:w10="urn:schemas-microsoft-com:office:word" xmlns:w="http://schemas.openxmlformats.org/wordprocessingml/2006/main" xmlns:w14="http://schemas.microsoft.com/office/word/2010/wordml" xmlns:w15="http://schemas.microsoft.com/office/word/2012/wordml" xmlns:w16cex="http://schemas.microsoft.com/office/word/2018/wordml/cex" xmlns:w16cid="http://schemas.microsoft.com/office/word/2016/wordml/cid" xmlns:w16="http://schemas.microsoft.com/office/word/2018/wordml" xmlns:w16du="http://schemas.microsoft.com/office/word/2023/wordml/word16du" xmlns:w16sdtdh="http://schemas.microsoft.com/office/word/2020/wordml/sdtdatahash" xmlns:w16sdtfl="http://schemas.microsoft.com/office/word/2024/wordml/sdtformatlock" xmlns:w16se="http://schemas.microsoft.com/office/word/2015/wordml/symex" xmlns:wpg="http://schemas.microsoft.com/office/word/2010/wordprocessingGroup" xmlns:wpi="http://schemas.microsoft.com/office/word/2010/wordprocessingInk" xmlns:wne="http://schemas.microsoft.com/office/word/2006/wordml" xmlns:wps="http://schemas.microsoft.com/office/word/2010/wordprocessingShape" mc:Ignorable="w14 w15 w16se w16cid w16 w16cex w16sdtdh w16sdtfl w16du wp14">
   <w15:person w15:author="Pauline Ward">
     <w15:presenceInfo w15:providerId="AD" w15:userId="S::pauline.ward5@phs.scot::a69170d4-5d26-490b-88d1-23a4a1e9207a"/>
   </w15:person>
@@ -1533,7 +1659,7 @@
 </file>
 
 <file path=word/styles.xml><?xml version="1.0" encoding="utf-8"?>
-<w:styles xmlns:mc="http://schemas.openxmlformats.org/markup-compatibility/2006" xmlns:r="http://schemas.openxmlformats.org/officeDocument/2006/relationships" xmlns:w="http://schemas.openxmlformats.org/wordprocessingml/2006/main" xmlns:w14="http://schemas.microsoft.com/office/word/2010/wordml" xmlns:w15="http://schemas.microsoft.com/office/word/2012/wordml" xmlns:w16cex="http://schemas.microsoft.com/office/word/2018/wordml/cex" xmlns:w16cid="http://schemas.microsoft.com/office/word/2016/wordml/cid" xmlns:w16="http://schemas.microsoft.com/office/word/2018/wordml" xmlns:w16du="http://schemas.microsoft.com/office/word/2023/wordml/word16du" xmlns:w16sdtdh="http://schemas.microsoft.com/office/word/2020/wordml/sdtdatahash" xmlns:w16se="http://schemas.microsoft.com/office/word/2015/wordml/symex" mc:Ignorable="w14 w15 w16se w16cid w16 w16cex w16sdtdh w16du">
+<w:styles xmlns:mc="http://schemas.openxmlformats.org/markup-compatibility/2006" xmlns:r="http://schemas.openxmlformats.org/officeDocument/2006/relationships" xmlns:w="http://schemas.openxmlformats.org/wordprocessingml/2006/main" xmlns:w14="http://schemas.microsoft.com/office/word/2010/wordml" xmlns:w15="http://schemas.microsoft.com/office/word/2012/wordml" xmlns:w16cex="http://schemas.microsoft.com/office/word/2018/wordml/cex" xmlns:w16cid="http://schemas.microsoft.com/office/word/2016/wordml/cid" xmlns:w16="http://schemas.microsoft.com/office/word/2018/wordml" xmlns:w16du="http://schemas.microsoft.com/office/word/2023/wordml/word16du" xmlns:w16sdtdh="http://schemas.microsoft.com/office/word/2020/wordml/sdtdatahash" xmlns:w16sdtfl="http://schemas.microsoft.com/office/word/2024/wordml/sdtformatlock" xmlns:w16se="http://schemas.microsoft.com/office/word/2015/wordml/symex" mc:Ignorable="w14 w15 w16se w16cid w16 w16cex w16sdtdh w16sdtfl w16du">
   <w:docDefaults>
     <w:rPrDefault>
       <w:rPr>
@@ -2056,6 +2182,40 @@
       <w:szCs w:val="20"/>
     </w:rPr>
   </w:style>
+  <w:style w:type="paragraph" w:styleId="Title">
+    <w:name w:val="Title"/>
+    <w:basedOn w:val="Normal"/>
+    <w:next w:val="Normal"/>
+    <w:link w:val="TitleChar"/>
+    <w:uiPriority w:val="10"/>
+    <w:qFormat/>
+    <w:rsid w:val="00FE3DA5"/>
+    <w:pPr>
+      <w:spacing w:after="0" w:line="240" w:lineRule="auto"/>
+      <w:contextualSpacing/>
+    </w:pPr>
+    <w:rPr>
+      <w:rFonts w:asciiTheme="majorHAnsi" w:eastAsiaTheme="majorEastAsia" w:hAnsiTheme="majorHAnsi" w:cstheme="majorBidi"/>
+      <w:spacing w:val="-10"/>
+      <w:kern w:val="28"/>
+      <w:sz w:val="56"/>
+      <w:szCs w:val="56"/>
+    </w:rPr>
+  </w:style>
+  <w:style w:type="character" w:customStyle="1" w:styleId="TitleChar">
+    <w:name w:val="Title Char"/>
+    <w:basedOn w:val="DefaultParagraphFont"/>
+    <w:link w:val="Title"/>
+    <w:uiPriority w:val="10"/>
+    <w:rsid w:val="00FE3DA5"/>
+    <w:rPr>
+      <w:rFonts w:asciiTheme="majorHAnsi" w:eastAsiaTheme="majorEastAsia" w:hAnsiTheme="majorHAnsi" w:cstheme="majorBidi"/>
+      <w:spacing w:val="-10"/>
+      <w:kern w:val="28"/>
+      <w:sz w:val="56"/>
+      <w:szCs w:val="56"/>
+    </w:rPr>
+  </w:style>
 </w:styles>
 </file>
 
@@ -2318,4 +2478,10 @@
     </a:ext>
   </a:extLst>
 </a:theme>
+</file>
+
+<file path=docMetadata/LabelInfo.xml><?xml version="1.0" encoding="utf-8"?>
+<clbl:labelList xmlns:clbl="http://schemas.microsoft.com/office/2020/mipLabelMetadata">
+  <clbl:label id="{b4199b9c-a89e-442f-9799-431511f14748}" enabled="1" method="Privileged" siteId="{10efe0bd-a030-4bca-809c-b5e6745e499a}" contentBits="0" removed="0"/>
+</clbl:labelList>
 </file>
</xml_diff>